<commit_message>
Harden IRC lifecycle, modularize queries and package runtime code
</commit_message>
<xml_diff>
--- a/submission/group_04_midproject/group_04.docx
+++ b/submission/group_04_midproject/group_04.docx
@@ -24,7 +24,7 @@
     </w:p>
     <w:p>
       <w:r>
-        <w:t>The group assigns an equal contribution share of 20% to each member. Student A participated across every area and led the common protocol layer. B/C formed the server pair and D/E formed the Bot pair, with A participating across both. The detailed functions below identify each member's main implementation areas.</w:t>
+        <w:t>The group assigns an equal contribution share of 20% to each member. Member A participated across every area and led the common protocol layer. B/C formed the server pair and D/E formed the Bot pair, with A participating across both. The detailed functions below identify each member's main implementation areas.</w:t>
       </w:r>
     </w:p>
     <w:tbl>
@@ -1471,7 +1471,7 @@
         <w:rPr>
           <w:sz w:val="18"/>
         </w:rPr>
-        <w:t>[1] DI 31001, "Project Brief: Coursework 1 Socket Programming," University of Dundee, 2026.</w:t>
+        <w:t>[1] DI 31001, "Project Brief: project 1 Socket Programming," University of Dundee, 2026.</w:t>
       </w:r>
     </w:p>
     <w:p>

</xml_diff>